<commit_message>
Add author-confirmed funding conflicts and secondary-analysis ethics
</commit_message>
<xml_diff>
--- a/research_runs/PAPER_FINAL_20261006/manuscript_en.docx
+++ b/research_runs/PAPER_FINAL_20261006/manuscript_en.docx
@@ -35,7 +35,7 @@
     </w:p>
     <w:p>
       <w:r>
-        <w:t>Scientific draft for author review — 7 October 2026. Declarations pending.</w:t>
+        <w:t>Scientific draft for author review — 7 October 2026.</w:t>
       </w:r>
     </w:p>
     <w:p>
@@ -3933,7 +3933,7 @@
     </w:p>
     <w:p>
       <w:r>
-        <w:t>The study uses public BNCI2014_001, PhysioNet, Cho2017, and Lee2019 recordings [1,2,5,6,25,7,8,9,10]; the providers’ licenses and usage terms apply. PhysioNet platform sources are cited separately [25,26]. No new participants were recruited and raw EEG is not redistributed in this manuscript bundle. The original collection ethics and consent are governed by the providers’ publications; the author must confirm the institutional requirements for secondary analysis before submission. No ethics approval identifier or consent waiver is asserted here.</w:t>
+        <w:t>The study uses public BNCI2014_001, PhysioNet, Cho2017, and Lee2019 recordings [1,2,5,6,25,7,8,9,10]; the providers’ licenses and usage terms apply. PhysioNet platform sources are cited separately [25,26]. No new participants were recruited and raw EEG is not redistributed in this manuscript bundle. The original collection ethics and participant consent are described in the providers’ publications. The author confirms that neither ethics approval nor an exemption was required for this secondary analysis. No approval or exemption identifier is applicable.</w:t>
       </w:r>
     </w:p>
     <w:p>
@@ -3943,7 +3943,7 @@
     </w:p>
     <w:p>
       <w:r>
-        <w:t>Author and corresponding author: Ziyuan Zhu. The title-page affiliation follows the author-provided institution and corroborated published English usage. Funding, competing interests, author contributions, and institutional secondary-analysis requirements remain to be confirmed by the author. AI assistance was used for manuscript drafting, language revision, and artifact preparation; the author must review the text and confirm responsibility for its scientific content. The journal-specific disclosure should describe the actual use and follow the selected journal’s policy. No funding award, competing-interest declaration, or completed human review is invented.</w:t>
+        <w:t>Author and corresponding author: Ziyuan Zhu. The title-page affiliation follows the author-provided institution and corroborated published English usage. Funding: This research received no funding. Competing interests: The author declares no competing interests. AI assistance was used for manuscript drafting, language revision, analysis-code development, and figure and artifact preparation. The author is responsible for reviewing and approving the final manuscript and for its scientific content. The journal-specific disclosure should describe the actual scope of assistance and follow the selected journal’s policy.</w:t>
       </w:r>
     </w:p>
     <w:p>

</xml_diff>

<commit_message>
Finalize author-approved JNE manuscript and truthful AI disclosure
</commit_message>
<xml_diff>
--- a/research_runs/PAPER_FINAL_20261006/manuscript_en.docx
+++ b/research_runs/PAPER_FINAL_20261006/manuscript_en.docx
@@ -56,6 +56,18 @@
           <w:sz w:val="20"/>
         </w:rPr>
         <w:t>Correspondence: zzy2630816871@gmail.com</w:t>
+      </w:r>
+    </w:p>
+    <w:p>
+      <w:pPr>
+        <w:keepLines/>
+        <w:jc w:val="center"/>
+      </w:pPr>
+      <w:r>
+        <w:rPr>
+          <w:sz w:val="20"/>
+        </w:rPr>
+        <w:t>Postal address: Jinyun Campus, Chongqing Medical University, No. 61, Daxuecheng Middle Road, Shapingba District, Chongqing 401331, China</w:t>
       </w:r>
     </w:p>
     <w:p>
@@ -6465,6 +6477,19 @@
         <w:pStyle w:val="Heading1"/>
       </w:pPr>
       <w:r>
+        <w:t>Author contributions</w:t>
+      </w:r>
+    </w:p>
+    <w:p>
+      <w:r>
+        <w:t>Ziyuan Zhu undertook the study as the sole author, prepared the manuscript, checked and revised its content, and approved the final version.</w:t>
+      </w:r>
+    </w:p>
+    <w:p>
+      <w:pPr>
+        <w:pStyle w:val="Heading1"/>
+      </w:pPr>
+      <w:r>
         <w:t>Acknowledgements</w:t>
       </w:r>
     </w:p>
@@ -6478,7 +6503,7 @@
     </w:p>
     <w:p>
       <w:r>
-        <w:t>OpenAI Codex assisted source and literature checks, analysis-code development, figure preparation, and manuscript drafting and language revision. The author is responsible for reviewing the final manuscript and for its scientific content.</w:t>
+        <w:t>ChatGPT (GPT-6, as reported by the author) assisted information retrieval, grammar revision, and preparation of instructions for publishing research materials to GitHub. OpenAI Codex assisted source and literature checks, analysis-code and verification-code development, saved-result consistency checks, figure preparation, and manuscript drafting and language revision. The author personally reviewed and revised the final manuscript and takes responsibility for its scientific content.</w:t>
       </w:r>
     </w:p>
     <w:p>
@@ -10950,7 +10975,7 @@
     </w:p>
     <w:p>
       <w:r>
-        <w:t>The manuscript bundle contains consistent English Markdown, editable DOCX, a PDF layout export, standalone LaTeX source with embedded numerical figure panels, the Chinese companion, figure sources and PNG/PDF/SVG exports, participant tables, a completed-condition inventory, verified references, independent numerical-audit scripts, and an author submission checklist. The main paper reports the retained scientific results; operational cloud failure logs do not substitute for scientific endpoints. All manuscript preparation fits and checkpoint-inference counts are zero. Funding, competing-interest and ethics statements reflect the author’s confirmation; journal-specific formatting and final manuscript approval remain to be completed before submission.</w:t>
+        <w:t>The manuscript bundle contains consistent English Markdown, editable DOCX, a PDF layout export, standalone LaTeX source with embedded numerical figure panels, the Chinese companion, figure sources and PNG/PDF/SVG exports, participant tables, a completed-condition inventory, verified references, independent numerical-audit scripts, and an author submission checklist. The main paper reports the retained scientific results; operational cloud failure logs do not substitute for scientific endpoints. All manuscript preparation fits and checkpoint-inference counts are zero. Funding, competing-interest and ethics statements reflect the author’s confirmation; the author has confirmed final manuscript review and approval; journal submission has not been performed.</w:t>
       </w:r>
     </w:p>
     <w:p>

</xml_diff>